<commit_message>
Correct document 18 for the client's real markets, add clarifying questions, and write a handoff
The client operates mainly in the Philippines and Malaysia and is entering
the GCC, not the other way round. Document 18 drops the Arabic assumption
and the named document stores, and no longer commits to a go-live date.

Adds 29 clarifying questions: five general ones up front, then what we
would need to know under each of the twelve points, so every assumption
in the document is visible as an open question rather than a claim.

HANDOFF.md records the full context for a new session, including the
jurisdiction correction that still has to be propagated through the other
seventeen documents, the verified facts behind it, the build gotchas, and
the audit corrections that must not regress.

Co-Authored-By: Claude Opus 5 <noreply@anthropic.com>
Claude-Session: https://claude.ai/code/session_01HFs5ZvxcqCGpfu8ascDZDB
</commit_message>
<xml_diff>
--- a/proposal/18_What_We_Will_Do_In_Plain_Words.docx
+++ b/proposal/18_What_We_Will_Do_In_Plain_Words.docx
@@ -49,18 +49,29 @@
           <w:sz w:val="19"/>
           <w:szCs w:val="19"/>
         </w:rPr>
-        <w:t>Every point you asked for, what we will do about it, and where we suggest going a little further</w:t>
-      </w:r>
-    </w:p>
-    <w:p>
-      <w:pPr>
-        <w:pStyle w:val="Normal"/>
-        <w:spacing w:lineRule="exact" w:line="276" w:before="0" w:after="120"/>
-        <w:rPr/>
-      </w:pPr>
-      <w:r>
-        <w:rPr/>
-        <w:t>This goes through your brief one point at a time, in the order you wrote it. For each point there are two short answers: what we will do, and what we suggest adding on top. We have kept the language deliberately plain. Nothing here needs a technical background to follow.</w:t>
+        <w:t>Every point you asked for, what we will do about it, what we suggest adding, and what we still need to know</w:t>
+      </w:r>
+    </w:p>
+    <w:p>
+      <w:pPr>
+        <w:pStyle w:val="Normal"/>
+        <w:spacing w:lineRule="exact" w:line="276" w:before="0" w:after="120"/>
+        <w:rPr/>
+      </w:pPr>
+      <w:r>
+        <w:rPr/>
+        <w:t>This goes through your brief one point at a time, in the order you wrote it. For each point there are three short parts: what we will do, what we suggest adding on top, and what we would still need to know before we can be precise about it. We have kept the language deliberately plain. Nothing here needs a technical background to follow.</w:t>
+      </w:r>
+    </w:p>
+    <w:p>
+      <w:pPr>
+        <w:pStyle w:val="Normal"/>
+        <w:spacing w:lineRule="exact" w:line="276" w:before="0" w:after="120"/>
+        <w:rPr/>
+      </w:pPr>
+      <w:r>
+        <w:rPr/>
+        <w:t>We have had to make some assumptions to get this far. Rather than hide them, we have turned each one into a question. The general questions come first, because they affect everything else.</w:t>
       </w:r>
     </w:p>
     <w:p>
@@ -71,6 +82,92 @@
       </w:pPr>
       <w:r>
         <w:rPr/>
+        <w:t>The general questions</w:t>
+      </w:r>
+    </w:p>
+    <w:p>
+      <w:pPr>
+        <w:pStyle w:val="ListParagraph"/>
+        <w:numPr>
+          <w:ilvl w:val="0"/>
+          <w:numId w:val="3"/>
+        </w:numPr>
+        <w:spacing w:lineRule="exact" w:line="264" w:before="0" w:after="60"/>
+        <w:rPr/>
+      </w:pPr>
+      <w:r>
+        <w:rPr/>
+        <w:t>Which countries and entities are in scope for the first release, and does that include the GCC entity from the start or later?</w:t>
+      </w:r>
+    </w:p>
+    <w:p>
+      <w:pPr>
+        <w:pStyle w:val="ListParagraph"/>
+        <w:numPr>
+          <w:ilvl w:val="0"/>
+          <w:numId w:val="1"/>
+        </w:numPr>
+        <w:spacing w:lineRule="exact" w:line="264" w:before="0" w:after="60"/>
+        <w:rPr/>
+      </w:pPr>
+      <w:r>
+        <w:rPr/>
+        <w:t>Which languages appear in your documents and your contact records, and roughly what share is each?</w:t>
+      </w:r>
+    </w:p>
+    <w:p>
+      <w:pPr>
+        <w:pStyle w:val="ListParagraph"/>
+        <w:numPr>
+          <w:ilvl w:val="0"/>
+          <w:numId w:val="1"/>
+        </w:numPr>
+        <w:spacing w:lineRule="exact" w:line="264" w:before="0" w:after="60"/>
+        <w:rPr/>
+      </w:pPr>
+      <w:r>
+        <w:rPr/>
+        <w:t>Who will be our day-to-day contact for decisions, and who gives final sign-off?</w:t>
+      </w:r>
+    </w:p>
+    <w:p>
+      <w:pPr>
+        <w:pStyle w:val="ListParagraph"/>
+        <w:numPr>
+          <w:ilvl w:val="0"/>
+          <w:numId w:val="1"/>
+        </w:numPr>
+        <w:spacing w:lineRule="exact" w:line="264" w:before="0" w:after="60"/>
+        <w:rPr/>
+      </w:pPr>
+      <w:r>
+        <w:rPr/>
+        <w:t>Is anything driving the timing, such as a board cycle, an audit, or the new market launch itself?</w:t>
+      </w:r>
+    </w:p>
+    <w:p>
+      <w:pPr>
+        <w:pStyle w:val="ListParagraph"/>
+        <w:numPr>
+          <w:ilvl w:val="0"/>
+          <w:numId w:val="1"/>
+        </w:numPr>
+        <w:spacing w:lineRule="exact" w:line="264" w:before="0" w:after="60"/>
+        <w:rPr/>
+      </w:pPr>
+      <w:r>
+        <w:rPr/>
+        <w:t>Are there security or compliance standards we must meet, or an audit this will need to pass?</w:t>
+      </w:r>
+    </w:p>
+    <w:p>
+      <w:pPr>
+        <w:pStyle w:val="Heading2"/>
+        <w:spacing w:before="280" w:after="120"/>
+        <w:rPr/>
+      </w:pPr>
+      <w:r>
+        <w:rPr/>
         <w:t>The document assistant</w:t>
       </w:r>
     </w:p>
@@ -123,6 +220,65 @@
     </w:p>
     <w:p>
       <w:pPr>
+        <w:pStyle w:val="Normal"/>
+        <w:spacing w:lineRule="exact" w:line="276" w:before="0" w:after="120"/>
+        <w:rPr/>
+      </w:pPr>
+      <w:r>
+        <w:rPr>
+          <w:b/>
+          <w:bCs/>
+        </w:rPr>
+        <w:t>What we would need to know.</w:t>
+      </w:r>
+    </w:p>
+    <w:p>
+      <w:pPr>
+        <w:pStyle w:val="ListParagraph"/>
+        <w:numPr>
+          <w:ilvl w:val="0"/>
+          <w:numId w:val="1"/>
+        </w:numPr>
+        <w:spacing w:lineRule="exact" w:line="264" w:before="0" w:after="60"/>
+        <w:rPr/>
+      </w:pPr>
+      <w:r>
+        <w:rPr/>
+        <w:t>Roughly how many documents are we talking about, and where do they live today?</w:t>
+      </w:r>
+    </w:p>
+    <w:p>
+      <w:pPr>
+        <w:pStyle w:val="ListParagraph"/>
+        <w:numPr>
+          <w:ilvl w:val="0"/>
+          <w:numId w:val="1"/>
+        </w:numPr>
+        <w:spacing w:lineRule="exact" w:line="264" w:before="0" w:after="60"/>
+        <w:rPr/>
+      </w:pPr>
+      <w:r>
+        <w:rPr/>
+        <w:t>How much of that is scanned paper rather than digital files?</w:t>
+      </w:r>
+    </w:p>
+    <w:p>
+      <w:pPr>
+        <w:pStyle w:val="ListParagraph"/>
+        <w:numPr>
+          <w:ilvl w:val="0"/>
+          <w:numId w:val="1"/>
+        </w:numPr>
+        <w:spacing w:lineRule="exact" w:line="264" w:before="0" w:after="60"/>
+        <w:rPr/>
+      </w:pPr>
+      <w:r>
+        <w:rPr/>
+        <w:t>Should access follow your existing folder permissions, or would you rather set it fresh?</w:t>
+      </w:r>
+    </w:p>
+    <w:p>
+      <w:pPr>
         <w:pStyle w:val="Heading3"/>
         <w:spacing w:before="200" w:after="100"/>
         <w:rPr/>
@@ -170,6 +326,50 @@
     </w:p>
     <w:p>
       <w:pPr>
+        <w:pStyle w:val="Normal"/>
+        <w:spacing w:lineRule="exact" w:line="276" w:before="0" w:after="120"/>
+        <w:rPr/>
+      </w:pPr>
+      <w:r>
+        <w:rPr>
+          <w:b/>
+          <w:bCs/>
+        </w:rPr>
+        <w:t>What we would need to know.</w:t>
+      </w:r>
+    </w:p>
+    <w:p>
+      <w:pPr>
+        <w:pStyle w:val="ListParagraph"/>
+        <w:numPr>
+          <w:ilvl w:val="0"/>
+          <w:numId w:val="1"/>
+        </w:numPr>
+        <w:spacing w:lineRule="exact" w:line="264" w:before="0" w:after="60"/>
+        <w:rPr/>
+      </w:pPr>
+      <w:r>
+        <w:rPr/>
+        <w:t>Do you keep old versions alongside final ones, and is there a naming pattern that tells them apart?</w:t>
+      </w:r>
+    </w:p>
+    <w:p>
+      <w:pPr>
+        <w:pStyle w:val="ListParagraph"/>
+        <w:numPr>
+          <w:ilvl w:val="0"/>
+          <w:numId w:val="1"/>
+        </w:numPr>
+        <w:spacing w:lineRule="exact" w:line="264" w:before="0" w:after="60"/>
+        <w:rPr/>
+      </w:pPr>
+      <w:r>
+        <w:rPr/>
+        <w:t>When two documents disagree, who decides which one is right, and does that change by document type?</w:t>
+      </w:r>
+    </w:p>
+    <w:p>
+      <w:pPr>
         <w:pStyle w:val="Heading3"/>
         <w:spacing w:before="200" w:after="100"/>
         <w:rPr/>
@@ -217,6 +417,50 @@
     </w:p>
     <w:p>
       <w:pPr>
+        <w:pStyle w:val="Normal"/>
+        <w:spacing w:lineRule="exact" w:line="276" w:before="0" w:after="120"/>
+        <w:rPr/>
+      </w:pPr>
+      <w:r>
+        <w:rPr>
+          <w:b/>
+          <w:bCs/>
+        </w:rPr>
+        <w:t>What we would need to know.</w:t>
+      </w:r>
+    </w:p>
+    <w:p>
+      <w:pPr>
+        <w:pStyle w:val="ListParagraph"/>
+        <w:numPr>
+          <w:ilvl w:val="0"/>
+          <w:numId w:val="1"/>
+        </w:numPr>
+        <w:spacing w:lineRule="exact" w:line="264" w:before="0" w:after="60"/>
+        <w:rPr/>
+      </w:pPr>
+      <w:r>
+        <w:rPr/>
+        <w:t>Which decisions would you want tracked first? Five to ten is enough to start.</w:t>
+      </w:r>
+    </w:p>
+    <w:p>
+      <w:pPr>
+        <w:pStyle w:val="ListParagraph"/>
+        <w:numPr>
+          <w:ilvl w:val="0"/>
+          <w:numId w:val="1"/>
+        </w:numPr>
+        <w:spacing w:lineRule="exact" w:line="264" w:before="0" w:after="60"/>
+        <w:rPr/>
+      </w:pPr>
+      <w:r>
+        <w:rPr/>
+        <w:t>Is there an existing approval checklist we should follow, or would we be writing it with you?</w:t>
+      </w:r>
+    </w:p>
+    <w:p>
+      <w:pPr>
         <w:pStyle w:val="Heading3"/>
         <w:spacing w:before="200" w:after="100"/>
         <w:rPr/>
@@ -241,7 +485,7 @@
       </w:r>
       <w:r>
         <w:rPr/>
-        <w:t xml:space="preserve"> Ask a normal question, in English or Arabic, and get a normal answer back.</w:t>
+        <w:t xml:space="preserve"> Ask a normal question in your own words and get a normal answer back. The system works across the languages your documents are actually written in.</w:t>
       </w:r>
     </w:p>
     <w:p>
@@ -260,6 +504,50 @@
       <w:r>
         <w:rPr/>
         <w:t xml:space="preserve"> After it writes the answer, a second and separate check reads that answer back against the sources and deletes any sentence the documents do not actually support. If nothing survives that check, it tells you the answer is not in your documents instead of inventing one. This is the main thing that separates it from a chatbot, and it is worth insisting on.</w:t>
+      </w:r>
+    </w:p>
+    <w:p>
+      <w:pPr>
+        <w:pStyle w:val="Normal"/>
+        <w:spacing w:lineRule="exact" w:line="276" w:before="0" w:after="120"/>
+        <w:rPr/>
+      </w:pPr>
+      <w:r>
+        <w:rPr>
+          <w:b/>
+          <w:bCs/>
+        </w:rPr>
+        <w:t>What we would need to know.</w:t>
+      </w:r>
+    </w:p>
+    <w:p>
+      <w:pPr>
+        <w:pStyle w:val="ListParagraph"/>
+        <w:numPr>
+          <w:ilvl w:val="0"/>
+          <w:numId w:val="1"/>
+        </w:numPr>
+        <w:spacing w:lineRule="exact" w:line="264" w:before="0" w:after="60"/>
+        <w:rPr/>
+      </w:pPr>
+      <w:r>
+        <w:rPr/>
+        <w:t>Who will be asking the questions, and roughly how many people?</w:t>
+      </w:r>
+    </w:p>
+    <w:p>
+      <w:pPr>
+        <w:pStyle w:val="ListParagraph"/>
+        <w:numPr>
+          <w:ilvl w:val="0"/>
+          <w:numId w:val="1"/>
+        </w:numPr>
+        <w:spacing w:lineRule="exact" w:line="264" w:before="0" w:after="60"/>
+        <w:rPr/>
+      </w:pPr>
+      <w:r>
+        <w:rPr/>
+        <w:t>Do they need answers in more than one language, and which ones?</w:t>
       </w:r>
     </w:p>
     <w:p>
@@ -322,6 +610,65 @@
     </w:p>
     <w:p>
       <w:pPr>
+        <w:pStyle w:val="Normal"/>
+        <w:spacing w:lineRule="exact" w:line="276" w:before="0" w:after="120"/>
+        <w:rPr/>
+      </w:pPr>
+      <w:r>
+        <w:rPr>
+          <w:b/>
+          <w:bCs/>
+        </w:rPr>
+        <w:t>What we would need to know.</w:t>
+      </w:r>
+    </w:p>
+    <w:p>
+      <w:pPr>
+        <w:pStyle w:val="ListParagraph"/>
+        <w:numPr>
+          <w:ilvl w:val="0"/>
+          <w:numId w:val="1"/>
+        </w:numPr>
+        <w:spacing w:lineRule="exact" w:line="264" w:before="0" w:after="60"/>
+        <w:rPr/>
+      </w:pPr>
+      <w:r>
+        <w:rPr/>
+        <w:t>What stages do your people actually use today for each group?</w:t>
+      </w:r>
+    </w:p>
+    <w:p>
+      <w:pPr>
+        <w:pStyle w:val="ListParagraph"/>
+        <w:numPr>
+          <w:ilvl w:val="0"/>
+          <w:numId w:val="1"/>
+        </w:numPr>
+        <w:spacing w:lineRule="exact" w:line="264" w:before="0" w:after="60"/>
+        <w:rPr/>
+      </w:pPr>
+      <w:r>
+        <w:rPr/>
+        <w:t>Is there an existing CRM or spreadsheet to bring across, and roughly how many records?</w:t>
+      </w:r>
+    </w:p>
+    <w:p>
+      <w:pPr>
+        <w:pStyle w:val="ListParagraph"/>
+        <w:numPr>
+          <w:ilvl w:val="0"/>
+          <w:numId w:val="1"/>
+        </w:numPr>
+        <w:spacing w:lineRule="exact" w:line="264" w:before="0" w:after="60"/>
+        <w:rPr/>
+      </w:pPr>
+      <w:r>
+        <w:rPr/>
+        <w:t>Is the GCC a market you are entering, and does a relationship there move differently from how it moves in your existing markets?</w:t>
+      </w:r>
+    </w:p>
+    <w:p>
+      <w:pPr>
         <w:pStyle w:val="Heading3"/>
         <w:spacing w:before="200" w:after="100"/>
         <w:rPr/>
@@ -369,6 +716,65 @@
     </w:p>
     <w:p>
       <w:pPr>
+        <w:pStyle w:val="Normal"/>
+        <w:spacing w:lineRule="exact" w:line="276" w:before="0" w:after="120"/>
+        <w:rPr/>
+      </w:pPr>
+      <w:r>
+        <w:rPr>
+          <w:b/>
+          <w:bCs/>
+        </w:rPr>
+        <w:t>What we would need to know.</w:t>
+      </w:r>
+    </w:p>
+    <w:p>
+      <w:pPr>
+        <w:pStyle w:val="ListParagraph"/>
+        <w:numPr>
+          <w:ilvl w:val="0"/>
+          <w:numId w:val="1"/>
+        </w:numPr>
+        <w:spacing w:lineRule="exact" w:line="264" w:before="0" w:after="60"/>
+        <w:rPr/>
+      </w:pPr>
+      <w:r>
+        <w:rPr/>
+        <w:t>After how long without contact should a relationship be flagged, and does that differ by group?</w:t>
+      </w:r>
+    </w:p>
+    <w:p>
+      <w:pPr>
+        <w:pStyle w:val="ListParagraph"/>
+        <w:numPr>
+          <w:ilvl w:val="0"/>
+          <w:numId w:val="1"/>
+        </w:numPr>
+        <w:spacing w:lineRule="exact" w:line="264" w:before="0" w:after="60"/>
+        <w:rPr/>
+      </w:pPr>
+      <w:r>
+        <w:rPr/>
+        <w:t>Should reminders go to the owner only, or to their manager as well?</w:t>
+      </w:r>
+    </w:p>
+    <w:p>
+      <w:pPr>
+        <w:pStyle w:val="ListParagraph"/>
+        <w:numPr>
+          <w:ilvl w:val="0"/>
+          <w:numId w:val="1"/>
+        </w:numPr>
+        <w:spacing w:lineRule="exact" w:line="264" w:before="0" w:after="60"/>
+        <w:rPr/>
+      </w:pPr>
+      <w:r>
+        <w:rPr/>
+        <w:t>Do your teams work across time zones we should take into account?</w:t>
+      </w:r>
+    </w:p>
+    <w:p>
+      <w:pPr>
         <w:pStyle w:val="Heading3"/>
         <w:spacing w:before="200" w:after="100"/>
         <w:rPr/>
@@ -416,6 +822,65 @@
     </w:p>
     <w:p>
       <w:pPr>
+        <w:pStyle w:val="Normal"/>
+        <w:spacing w:lineRule="exact" w:line="276" w:before="0" w:after="120"/>
+        <w:rPr/>
+      </w:pPr>
+      <w:r>
+        <w:rPr>
+          <w:b/>
+          <w:bCs/>
+        </w:rPr>
+        <w:t>What we would need to know.</w:t>
+      </w:r>
+    </w:p>
+    <w:p>
+      <w:pPr>
+        <w:pStyle w:val="ListParagraph"/>
+        <w:numPr>
+          <w:ilvl w:val="0"/>
+          <w:numId w:val="1"/>
+        </w:numPr>
+        <w:spacing w:lineRule="exact" w:line="264" w:before="0" w:after="60"/>
+        <w:rPr/>
+      </w:pPr>
+      <w:r>
+        <w:rPr/>
+        <w:t>Who approves outreach for each of the three groups?</w:t>
+      </w:r>
+    </w:p>
+    <w:p>
+      <w:pPr>
+        <w:pStyle w:val="ListParagraph"/>
+        <w:numPr>
+          <w:ilvl w:val="0"/>
+          <w:numId w:val="1"/>
+        </w:numPr>
+        <w:spacing w:lineRule="exact" w:line="264" w:before="0" w:after="60"/>
+        <w:rPr/>
+      </w:pPr>
+      <w:r>
+        <w:rPr/>
+        <w:t>Are there recipients who should need a second, more senior approval?</w:t>
+      </w:r>
+    </w:p>
+    <w:p>
+      <w:pPr>
+        <w:pStyle w:val="ListParagraph"/>
+        <w:numPr>
+          <w:ilvl w:val="0"/>
+          <w:numId w:val="1"/>
+        </w:numPr>
+        <w:spacing w:lineRule="exact" w:line="264" w:before="0" w:after="60"/>
+        <w:rPr/>
+      </w:pPr>
+      <w:r>
+        <w:rPr/>
+        <w:t>Which channels do you actually use: email only, or messaging apps as well?</w:t>
+      </w:r>
+    </w:p>
+    <w:p>
+      <w:pPr>
         <w:pStyle w:val="Heading3"/>
         <w:spacing w:before="200" w:after="100"/>
         <w:rPr/>
@@ -463,6 +928,50 @@
     </w:p>
     <w:p>
       <w:pPr>
+        <w:pStyle w:val="Normal"/>
+        <w:spacing w:lineRule="exact" w:line="276" w:before="0" w:after="120"/>
+        <w:rPr/>
+      </w:pPr>
+      <w:r>
+        <w:rPr>
+          <w:b/>
+          <w:bCs/>
+        </w:rPr>
+        <w:t>What we would need to know.</w:t>
+      </w:r>
+    </w:p>
+    <w:p>
+      <w:pPr>
+        <w:pStyle w:val="ListParagraph"/>
+        <w:numPr>
+          <w:ilvl w:val="0"/>
+          <w:numId w:val="1"/>
+        </w:numPr>
+        <w:spacing w:lineRule="exact" w:line="264" w:before="0" w:after="60"/>
+        <w:rPr/>
+      </w:pPr>
+      <w:r>
+        <w:rPr/>
+        <w:t>Which three reports would you look at most often?</w:t>
+      </w:r>
+    </w:p>
+    <w:p>
+      <w:pPr>
+        <w:pStyle w:val="ListParagraph"/>
+        <w:numPr>
+          <w:ilvl w:val="0"/>
+          <w:numId w:val="1"/>
+        </w:numPr>
+        <w:spacing w:lineRule="exact" w:line="264" w:before="0" w:after="60"/>
+        <w:rPr/>
+      </w:pPr>
+      <w:r>
+        <w:rPr/>
+        <w:t>Does anyone outside the immediate team need them, such as the board, compliance or auditors?</w:t>
+      </w:r>
+    </w:p>
+    <w:p>
+      <w:pPr>
         <w:pStyle w:val="Heading2"/>
         <w:spacing w:before="280" w:after="120"/>
         <w:rPr/>
@@ -496,6 +1005,65 @@
     </w:p>
     <w:p>
       <w:pPr>
+        <w:pStyle w:val="Normal"/>
+        <w:spacing w:lineRule="exact" w:line="276" w:before="0" w:after="120"/>
+        <w:rPr/>
+      </w:pPr>
+      <w:r>
+        <w:rPr>
+          <w:b/>
+          <w:bCs/>
+        </w:rPr>
+        <w:t>What we would need to know.</w:t>
+      </w:r>
+    </w:p>
+    <w:p>
+      <w:pPr>
+        <w:pStyle w:val="ListParagraph"/>
+        <w:numPr>
+          <w:ilvl w:val="0"/>
+          <w:numId w:val="1"/>
+        </w:numPr>
+        <w:spacing w:lineRule="exact" w:line="264" w:before="0" w:after="60"/>
+        <w:rPr/>
+      </w:pPr>
+      <w:r>
+        <w:rPr/>
+        <w:t>Which cloud provider do you already use, and in which region?</w:t>
+      </w:r>
+    </w:p>
+    <w:p>
+      <w:pPr>
+        <w:pStyle w:val="ListParagraph"/>
+        <w:numPr>
+          <w:ilvl w:val="0"/>
+          <w:numId w:val="1"/>
+        </w:numPr>
+        <w:spacing w:lineRule="exact" w:line="264" w:before="0" w:after="60"/>
+        <w:rPr/>
+      </w:pPr>
+      <w:r>
+        <w:rPr/>
+        <w:t>What do your staff sign in with today?</w:t>
+      </w:r>
+    </w:p>
+    <w:p>
+      <w:pPr>
+        <w:pStyle w:val="ListParagraph"/>
+        <w:numPr>
+          <w:ilvl w:val="0"/>
+          <w:numId w:val="1"/>
+        </w:numPr>
+        <w:spacing w:lineRule="exact" w:line="264" w:before="0" w:after="60"/>
+        <w:rPr/>
+      </w:pPr>
+      <w:r>
+        <w:rPr/>
+        <w:t>Are there IT standards or an approved supplier list we need to work within?</w:t>
+      </w:r>
+    </w:p>
+    <w:p>
+      <w:pPr>
         <w:pStyle w:val="Heading3"/>
         <w:spacing w:before="200" w:after="100"/>
         <w:rPr/>
@@ -513,7 +1081,51 @@
       </w:pPr>
       <w:r>
         <w:rPr/>
-        <w:t>Everything that varies is a setting rather than code. A new field, a new stage, a new category, a new decision checklist: an administrator adds these in the screen. Contacts come in from a spreadsheet, with a preview that shows you what is wrong before anything is saved. Documents come from SharePoint, Google Drive or a mailbox. All the demo data is tagged separately, so a single action clears it when your real data arrives.</w:t>
+        <w:t>Everything that varies is a setting rather than code. A new field, a new stage, a new category, a new decision checklist: an administrator adds these in the screen. Contacts come in from a spreadsheet, with a preview that shows you what is wrong before anything is saved. Documents come from your existing document store or a mailbox. All the demo data is tagged separately, so a single action clears it when your real data arrives.</w:t>
+      </w:r>
+    </w:p>
+    <w:p>
+      <w:pPr>
+        <w:pStyle w:val="Normal"/>
+        <w:spacing w:lineRule="exact" w:line="276" w:before="0" w:after="120"/>
+        <w:rPr/>
+      </w:pPr>
+      <w:r>
+        <w:rPr>
+          <w:b/>
+          <w:bCs/>
+        </w:rPr>
+        <w:t>What we would need to know.</w:t>
+      </w:r>
+    </w:p>
+    <w:p>
+      <w:pPr>
+        <w:pStyle w:val="ListParagraph"/>
+        <w:numPr>
+          <w:ilvl w:val="0"/>
+          <w:numId w:val="1"/>
+        </w:numPr>
+        <w:spacing w:lineRule="exact" w:line="264" w:before="0" w:after="60"/>
+        <w:rPr/>
+      </w:pPr>
+      <w:r>
+        <w:rPr/>
+        <w:t>Which existing systems does this need to work alongside?</w:t>
+      </w:r>
+    </w:p>
+    <w:p>
+      <w:pPr>
+        <w:pStyle w:val="ListParagraph"/>
+        <w:numPr>
+          <w:ilvl w:val="0"/>
+          <w:numId w:val="1"/>
+        </w:numPr>
+        <w:spacing w:lineRule="exact" w:line="264" w:before="0" w:after="60"/>
+        <w:rPr/>
+      </w:pPr>
+      <w:r>
+        <w:rPr/>
+        <w:t>Who on your side would own the day-to-day settings once it is live?</w:t>
       </w:r>
     </w:p>
     <w:p>
@@ -532,7 +1144,7 @@
         <w:pStyle w:val="ListParagraph"/>
         <w:numPr>
           <w:ilvl w:val="0"/>
-          <w:numId w:val="3"/>
+          <w:numId w:val="1"/>
         </w:numPr>
         <w:spacing w:lineRule="exact" w:line="264" w:before="0" w:after="60"/>
         <w:rPr/>
@@ -595,24 +1207,13 @@
     </w:p>
     <w:p>
       <w:pPr>
-        <w:pStyle w:val="ListParagraph"/>
-        <w:numPr>
-          <w:ilvl w:val="0"/>
-          <w:numId w:val="1"/>
-        </w:numPr>
-        <w:spacing w:lineRule="exact" w:line="264" w:before="0" w:after="60"/>
-        <w:rPr/>
-      </w:pPr>
-      <w:r>
-        <w:rPr>
-          <w:b/>
-          <w:bCs/>
-        </w:rPr>
-        <w:t>Week 20.</w:t>
-      </w:r>
-      <w:r>
-        <w:rPr/>
-        <w:t xml:space="preserve"> Live.</w:t>
+        <w:pStyle w:val="Normal"/>
+        <w:spacing w:lineRule="exact" w:line="276" w:before="0" w:after="120"/>
+        <w:rPr/>
+      </w:pPr>
+      <w:r>
+        <w:rPr/>
+        <w:t>We would rather not put a date on go-live until we have the answers below. The three milestones above we are comfortable with; the last step depends on things we cannot see yet.</w:t>
       </w:r>
     </w:p>
     <w:p>
@@ -624,6 +1225,65 @@
       <w:r>
         <w:rPr/>
         <w:t>This assumes sample documents and system access reach us in the first two weeks. If it would help to see something sooner, we can put a clickable version on sample documents in front of you at around week 4.</w:t>
+      </w:r>
+    </w:p>
+    <w:p>
+      <w:pPr>
+        <w:pStyle w:val="Normal"/>
+        <w:spacing w:lineRule="exact" w:line="276" w:before="0" w:after="120"/>
+        <w:rPr/>
+      </w:pPr>
+      <w:r>
+        <w:rPr>
+          <w:b/>
+          <w:bCs/>
+        </w:rPr>
+        <w:t>What we would need to know.</w:t>
+      </w:r>
+    </w:p>
+    <w:p>
+      <w:pPr>
+        <w:pStyle w:val="ListParagraph"/>
+        <w:numPr>
+          <w:ilvl w:val="0"/>
+          <w:numId w:val="1"/>
+        </w:numPr>
+        <w:spacing w:lineRule="exact" w:line="264" w:before="0" w:after="60"/>
+        <w:rPr/>
+      </w:pPr>
+      <w:r>
+        <w:rPr/>
+        <w:t>When would you like this live, and what is driving that date?</w:t>
+      </w:r>
+    </w:p>
+    <w:p>
+      <w:pPr>
+        <w:pStyle w:val="ListParagraph"/>
+        <w:numPr>
+          <w:ilvl w:val="0"/>
+          <w:numId w:val="1"/>
+        </w:numPr>
+        <w:spacing w:lineRule="exact" w:line="264" w:before="0" w:after="60"/>
+        <w:rPr/>
+      </w:pPr>
+      <w:r>
+        <w:rPr/>
+        <w:t>Who approves access to your cloud and email systems, and how long does that normally take with you?</w:t>
+      </w:r>
+    </w:p>
+    <w:p>
+      <w:pPr>
+        <w:pStyle w:val="ListParagraph"/>
+        <w:numPr>
+          <w:ilvl w:val="0"/>
+          <w:numId w:val="1"/>
+        </w:numPr>
+        <w:spacing w:lineRule="exact" w:line="264" w:before="0" w:after="60"/>
+        <w:rPr/>
+      </w:pPr>
+      <w:r>
+        <w:rPr/>
+        <w:t>Are there periods we should plan around?</w:t>
       </w:r>
     </w:p>
     <w:p>
@@ -700,7 +1360,51 @@
       </w:pPr>
       <w:r>
         <w:rPr/>
-        <w:t>After go-live there is an annual fee for keeping the system running and improving it. Every assumption behind these numbers is in a workbook we can walk through with you line by line.</w:t>
+        <w:t>After go-live there is an annual fee for keeping the system running and improving it.</w:t>
+      </w:r>
+    </w:p>
+    <w:p>
+      <w:pPr>
+        <w:pStyle w:val="Normal"/>
+        <w:spacing w:lineRule="exact" w:line="276" w:before="0" w:after="120"/>
+        <w:rPr/>
+      </w:pPr>
+      <w:r>
+        <w:rPr>
+          <w:b/>
+          <w:bCs/>
+        </w:rPr>
+        <w:t>What we would need to know.</w:t>
+      </w:r>
+    </w:p>
+    <w:p>
+      <w:pPr>
+        <w:pStyle w:val="ListParagraph"/>
+        <w:numPr>
+          <w:ilvl w:val="0"/>
+          <w:numId w:val="1"/>
+        </w:numPr>
+        <w:spacing w:lineRule="exact" w:line="264" w:before="0" w:after="60"/>
+        <w:rPr/>
+      </w:pPr>
+      <w:r>
+        <w:rPr/>
+        <w:t>Is there a budget range or an approval threshold we should design to?</w:t>
+      </w:r>
+    </w:p>
+    <w:p>
+      <w:pPr>
+        <w:pStyle w:val="ListParagraph"/>
+        <w:numPr>
+          <w:ilvl w:val="0"/>
+          <w:numId w:val="1"/>
+        </w:numPr>
+        <w:spacing w:lineRule="exact" w:line="264" w:before="0" w:after="60"/>
+        <w:rPr/>
+      </w:pPr>
+      <w:r>
+        <w:rPr/>
+        <w:t>Would you rather pay stage by stage, or as an annual subscription?</w:t>
       </w:r>
     </w:p>
     <w:p>
@@ -845,7 +1549,7 @@
     </w:r>
     <w:r>
       <w:rPr/>
-      <w:t>3</w:t>
+      <w:t>4</w:t>
     </w:r>
     <w:r>
       <w:rPr/>
@@ -873,7 +1577,7 @@
     </w:r>
     <w:r>
       <w:rPr/>
-      <w:t>3</w:t>
+      <w:t>4</w:t>
     </w:r>
     <w:r>
       <w:rPr/>
@@ -918,7 +1622,7 @@
     </w:r>
     <w:r>
       <w:rPr/>
-      <w:t>3</w:t>
+      <w:t>4</w:t>
     </w:r>
     <w:r>
       <w:rPr/>
@@ -946,7 +1650,7 @@
     </w:r>
     <w:r>
       <w:rPr/>
-      <w:t>3</w:t>
+      <w:t>4</w:t>
     </w:r>
     <w:r>
       <w:rPr/>

</xml_diff>